<commit_message>
metrics with pretrain model
</commit_message>
<xml_diff>
--- a/Bao_cao_danh_gia_model_embedding_finetune.docx
+++ b/Bao_cao_danh_gia_model_embedding_finetune.docx
@@ -2651,179 +2651,18 @@
     </w:p>
     <w:p>
       <w:pPr>
-        <w:pStyle w:val="Heading1"/>
-        <w:rPr>
-          <w:rFonts w:ascii="Times New Roman" w:hAnsi="Times New Roman" w:cs="Times New Roman"/>
-          <w:color w:val="auto"/>
-        </w:rPr>
-      </w:pPr>
-      <w:r>
-        <w:rPr>
-          <w:rFonts w:ascii="Times New Roman" w:hAnsi="Times New Roman" w:cs="Times New Roman"/>
-          <w:color w:val="auto"/>
-        </w:rPr>
-        <w:lastRenderedPageBreak/>
-        <w:t>10. Khuyến nghị</w:t>
-      </w:r>
-    </w:p>
-    <w:p>
-      <w:pPr>
+        <w:pStyle w:val="ListBullet"/>
+        <w:numPr>
+          <w:ilvl w:val="0"/>
+          <w:numId w:val="0"/>
+        </w:numPr>
+        <w:ind w:left="360"/>
         <w:rPr>
           <w:rFonts w:ascii="Times New Roman" w:hAnsi="Times New Roman" w:cs="Times New Roman"/>
           <w:sz w:val="28"/>
           <w:szCs w:val="28"/>
         </w:rPr>
       </w:pPr>
-      <w:r>
-        <w:rPr>
-          <w:rFonts w:ascii="Times New Roman" w:hAnsi="Times New Roman" w:cs="Times New Roman"/>
-          <w:sz w:val="28"/>
-          <w:szCs w:val="28"/>
-        </w:rPr>
-        <w:t>Dùng fine-tuned làm model retrieval chính cho MVP, giữ pretrained làm fallback. Chưa production-final cho đến khi Precision@5/10 và đánh giá thủ công mở rộng đạt ngưỡng.</w:t>
-      </w:r>
-    </w:p>
-    <w:p>
-      <w:pPr>
-        <w:pStyle w:val="Heading1"/>
-        <w:rPr>
-          <w:rFonts w:ascii="Times New Roman" w:hAnsi="Times New Roman" w:cs="Times New Roman"/>
-          <w:color w:val="auto"/>
-        </w:rPr>
-      </w:pPr>
-      <w:r>
-        <w:rPr>
-          <w:rFonts w:ascii="Times New Roman" w:hAnsi="Times New Roman" w:cs="Times New Roman"/>
-          <w:color w:val="auto"/>
-        </w:rPr>
-        <w:t>11. Phụ lục - Cấu hình huấn luyện</w:t>
-      </w:r>
-    </w:p>
-    <w:p>
-      <w:pPr>
-        <w:pStyle w:val="ListBullet"/>
-        <w:rPr>
-          <w:rFonts w:ascii="Times New Roman" w:hAnsi="Times New Roman" w:cs="Times New Roman"/>
-          <w:sz w:val="28"/>
-          <w:szCs w:val="28"/>
-        </w:rPr>
-      </w:pPr>
-      <w:r>
-        <w:rPr>
-          <w:rFonts w:ascii="Times New Roman" w:hAnsi="Times New Roman" w:cs="Times New Roman"/>
-          <w:sz w:val="28"/>
-          <w:szCs w:val="28"/>
-        </w:rPr>
-        <w:t>Base: paraphrase-multilingual-MiniLM-L12-v2</w:t>
-      </w:r>
-    </w:p>
-    <w:p>
-      <w:pPr>
-        <w:pStyle w:val="ListBullet"/>
-        <w:rPr>
-          <w:rFonts w:ascii="Times New Roman" w:hAnsi="Times New Roman" w:cs="Times New Roman"/>
-          <w:sz w:val="28"/>
-          <w:szCs w:val="28"/>
-        </w:rPr>
-      </w:pPr>
-      <w:r>
-        <w:rPr>
-          <w:rFonts w:ascii="Times New Roman" w:hAnsi="Times New Roman" w:cs="Times New Roman"/>
-          <w:sz w:val="28"/>
-          <w:szCs w:val="28"/>
-        </w:rPr>
-        <w:t>Loss: MultipleNegativesRankingLoss</w:t>
-      </w:r>
-    </w:p>
-    <w:p>
-      <w:pPr>
-        <w:pStyle w:val="ListBullet"/>
-        <w:rPr>
-          <w:rFonts w:ascii="Times New Roman" w:hAnsi="Times New Roman" w:cs="Times New Roman"/>
-          <w:sz w:val="28"/>
-          <w:szCs w:val="28"/>
-        </w:rPr>
-      </w:pPr>
-      <w:r>
-        <w:rPr>
-          <w:rFonts w:ascii="Times New Roman" w:hAnsi="Times New Roman" w:cs="Times New Roman"/>
-          <w:sz w:val="28"/>
-          <w:szCs w:val="28"/>
-        </w:rPr>
-        <w:t>Epochs: 2-3</w:t>
-      </w:r>
-    </w:p>
-    <w:p>
-      <w:pPr>
-        <w:pStyle w:val="ListBullet"/>
-        <w:rPr>
-          <w:rFonts w:ascii="Times New Roman" w:hAnsi="Times New Roman" w:cs="Times New Roman"/>
-          <w:sz w:val="28"/>
-          <w:szCs w:val="28"/>
-        </w:rPr>
-      </w:pPr>
-      <w:r>
-        <w:rPr>
-          <w:rFonts w:ascii="Times New Roman" w:hAnsi="Times New Roman" w:cs="Times New Roman"/>
-          <w:sz w:val="28"/>
-          <w:szCs w:val="28"/>
-        </w:rPr>
-        <w:t>Batch size: 8-16</w:t>
-      </w:r>
-    </w:p>
-    <w:p>
-      <w:pPr>
-        <w:pStyle w:val="ListBullet"/>
-        <w:rPr>
-          <w:rFonts w:ascii="Times New Roman" w:hAnsi="Times New Roman" w:cs="Times New Roman"/>
-          <w:sz w:val="28"/>
-          <w:szCs w:val="28"/>
-        </w:rPr>
-      </w:pPr>
-      <w:r>
-        <w:rPr>
-          <w:rFonts w:ascii="Times New Roman" w:hAnsi="Times New Roman" w:cs="Times New Roman"/>
-          <w:sz w:val="28"/>
-          <w:szCs w:val="28"/>
-        </w:rPr>
-        <w:t>Learning rate: 2e-5</w:t>
-      </w:r>
-    </w:p>
-    <w:p>
-      <w:pPr>
-        <w:pStyle w:val="ListBullet"/>
-        <w:rPr>
-          <w:rFonts w:ascii="Times New Roman" w:hAnsi="Times New Roman" w:cs="Times New Roman"/>
-          <w:sz w:val="28"/>
-          <w:szCs w:val="28"/>
-        </w:rPr>
-      </w:pPr>
-      <w:r>
-        <w:rPr>
-          <w:rFonts w:ascii="Times New Roman" w:hAnsi="Times New Roman" w:cs="Times New Roman"/>
-          <w:sz w:val="28"/>
-          <w:szCs w:val="28"/>
-        </w:rPr>
-        <w:t>Max seq length: 256-384</w:t>
-      </w:r>
-    </w:p>
-    <w:p>
-      <w:pPr>
-        <w:pStyle w:val="ListBullet"/>
-        <w:rPr>
-          <w:rFonts w:ascii="Times New Roman" w:hAnsi="Times New Roman" w:cs="Times New Roman"/>
-          <w:sz w:val="28"/>
-          <w:szCs w:val="28"/>
-        </w:rPr>
-      </w:pPr>
-      <w:r>
-        <w:rPr>
-          <w:rFonts w:ascii="Times New Roman" w:hAnsi="Times New Roman" w:cs="Times New Roman"/>
-          <w:sz w:val="28"/>
-          <w:szCs w:val="28"/>
-        </w:rPr>
-        <w:t>Warmup: 0.1</w:t>
-      </w:r>
     </w:p>
     <w:sectPr>
       <w:pgSz w:w="12240" w:h="15840"/>

</xml_diff>